<commit_message>
Press page: AMINA's approved quote from Markos Theologitis
Supplied by AMINA on 28 September and approved for use, so it is set verbatim,
em-dash and all: capability without accountability is where a regulated bank
earns its place in the stack. It sits after Tim Grant's quote in the rendered
release, in the copy-paste version and in the downloadable Word file, which
still sets to two pages.

Co-Authored-By: Claude Opus 5 <noreply@anthropic.com>
</commit_message>
<xml_diff>
--- a/assets/press/agentic-finance-report-press-release.docx
+++ b/assets/press/agentic-finance-report-press-release.docx
@@ -241,6 +241,38 @@
           <w:szCs w:val="20"/>
         </w:rPr>
         <w:t xml:space="preserve">Tim Grant, Executive Chairman, TensorX, from his foreword to the report</w:t>
+      </w:r>
+    </w:p>
+    <w:p>
+      <w:pPr>
+        <w:pBdr>
+          <w:left w:val="single" w:color="386AFF" w:sz="12" w:space="12"/>
+        </w:pBdr>
+        <w:spacing w:after="80" w:before="160"/>
+        <w:ind w:left="567"/>
+      </w:pPr>
+      <w:r>
+        <w:rPr>
+          <w:i/>
+          <w:iCs/>
+          <w:sz w:val="24"/>
+          <w:szCs w:val="24"/>
+        </w:rPr>
+        <w:t xml:space="preserve">‘An AI agent can decide to move capital at three in the morning. It cannot hold a licence, face a regulator, or absorb a loss. That gap between capability and accountability is where a regulated bank earns its place in this stack — not as an obstacle to speed, but as the reason speed becomes permissible.’</w:t>
+      </w:r>
+    </w:p>
+    <w:p>
+      <w:pPr>
+        <w:spacing w:after="220"/>
+        <w:ind w:left="567"/>
+      </w:pPr>
+      <w:r>
+        <w:rPr>
+          <w:color w:val="444444"/>
+          <w:sz w:val="20"/>
+          <w:szCs w:val="20"/>
+        </w:rPr>
+        <w:t xml:space="preserve">Markos Theologitis, Chief Technology Officer, AMINA Bank</w:t>
       </w:r>
     </w:p>
     <w:p>

</xml_diff>